<commit_message>
Tony Tornado: revisão da Parte 4
Co-Authored-By: Claude Opus 5.5 <noreply@anthropic.com>
Claude-Session: https://claude.ai/code/session_01MJjUEEZrxQDEUifKK2vj9g
</commit_message>
<xml_diff>
--- a/roteiros/tony-tornado/Tony_Parte4.docx
+++ b/roteiros/tony-tornado/Tony_Parte4.docx
@@ -15,7 +15,23 @@
         <w:rPr>
           <w:color w:val="000000"/>
         </w:rPr>
-        <w:t>Para entender o que esperava Tony depois daquele palco, é preciso conhecer uma sigla que dava medo em qualquer brasileiro daquela época.</w:t>
+        <w:t>"Canta aí, rodopia."</w:t>
+      </w:r>
+    </w:p>
+    <w:p>
+      <w:r>
+        <w:rPr>
+          <w:color w:val="000000"/>
+        </w:rPr>
+        <w:t>Segundo Tony, era assim que os agentes falavam com ele, depois que as portas se fechavam.</w:t>
+      </w:r>
+    </w:p>
+    <w:p>
+      <w:r>
+        <w:rPr>
+          <w:color w:val="000000"/>
+        </w:rPr>
+        <w:t>Para entender onde ele estava, é preciso conhecer uma sigla que dava medo em qualquer brasileiro daquela época.</w:t>
       </w:r>
     </w:p>
     <w:p>
@@ -47,7 +63,7 @@
         <w:rPr>
           <w:color w:val="000000"/>
         </w:rPr>
-        <w:t>Ele contou, anos depois, o que os agentes diziam a ele lá dentro.</w:t>
+        <w:t>O deboche do "canta aí, rodopia" era só o começo.</w:t>
       </w:r>
     </w:p>
     <w:p>
@@ -55,23 +71,7 @@
         <w:rPr>
           <w:color w:val="000000"/>
         </w:rPr>
-        <w:t>Primeiro vinha o deboche.</w:t>
-      </w:r>
-    </w:p>
-    <w:p>
-      <w:r>
-        <w:rPr>
-          <w:color w:val="000000"/>
-        </w:rPr>
-        <w:t>"Canta aí, rodopia."</w:t>
-      </w:r>
-    </w:p>
-    <w:p>
-      <w:r>
-        <w:rPr>
-          <w:color w:val="000000"/>
-        </w:rPr>
-        <w:t>Depois, a comparação.</w:t>
+        <w:t>Depois vinha a comparação.</w:t>
       </w:r>
     </w:p>
     <w:p>
@@ -111,7 +111,7 @@
         <w:rPr>
           <w:color w:val="000000"/>
         </w:rPr>
-        <w:t>Para aqueles policiais, o ex-soldado tinha virado um traidor.</w:t>
+        <w:t>Na cabeça daqueles policiais, o ex-soldado tinha passado para o lado do inimigo.</w:t>
       </w:r>
     </w:p>
     <w:p>
@@ -151,7 +151,7 @@
         <w:rPr>
           <w:color w:val="000000"/>
         </w:rPr>
-        <w:t>Ele lembrou também do nome que ouvia.</w:t>
+        <w:t>Ele lembra também o apelido que ouvia.</w:t>
       </w:r>
     </w:p>
     <w:p>

</xml_diff>